<commit_message>
Faire la version 2
</commit_message>
<xml_diff>
--- a/Personnel/e-306-etude-opportunite.docx
+++ b/Personnel/e-306-etude-opportunite.docx
@@ -559,7 +559,27 @@
           <w:sz w:val="32"/>
           <w:szCs w:val="32"/>
         </w:rPr>
-        <w:t>Forces (=Strengths)</w:t>
+        <w:t>Forces (=</w:t>
+      </w:r>
+      <w:proofErr w:type="spellStart"/>
+      <w:r>
+        <w:rPr>
+          <w:rFonts w:ascii="Calibri" w:hAnsi="Calibri"/>
+          <w:color w:val="1E4E79"/>
+          <w:sz w:val="32"/>
+          <w:szCs w:val="32"/>
+        </w:rPr>
+        <w:t>Strengths</w:t>
+      </w:r>
+      <w:proofErr w:type="spellEnd"/>
+      <w:r>
+        <w:rPr>
+          <w:rFonts w:ascii="Calibri" w:hAnsi="Calibri"/>
+          <w:color w:val="1E4E79"/>
+          <w:sz w:val="32"/>
+          <w:szCs w:val="32"/>
+        </w:rPr>
+        <w:t>)</w:t>
       </w:r>
     </w:p>
     <w:p>
@@ -704,7 +724,27 @@
           <w:sz w:val="32"/>
           <w:szCs w:val="32"/>
         </w:rPr>
-        <w:t>Faiblesses (=Weaknesses)</w:t>
+        <w:t>Faiblesses (=</w:t>
+      </w:r>
+      <w:proofErr w:type="spellStart"/>
+      <w:r>
+        <w:rPr>
+          <w:rFonts w:ascii="Calibri" w:hAnsi="Calibri"/>
+          <w:color w:val="1E4E79"/>
+          <w:sz w:val="32"/>
+          <w:szCs w:val="32"/>
+        </w:rPr>
+        <w:t>Weaknesses</w:t>
+      </w:r>
+      <w:proofErr w:type="spellEnd"/>
+      <w:r>
+        <w:rPr>
+          <w:rFonts w:ascii="Calibri" w:hAnsi="Calibri"/>
+          <w:color w:val="1E4E79"/>
+          <w:sz w:val="32"/>
+          <w:szCs w:val="32"/>
+        </w:rPr>
+        <w:t>)</w:t>
       </w:r>
     </w:p>
     <w:p>
@@ -827,7 +867,27 @@
           <w:szCs w:val="32"/>
         </w:rPr>
         <w:lastRenderedPageBreak/>
-        <w:t>Opportunités (=Opportunities)</w:t>
+        <w:t>Opportunités (=</w:t>
+      </w:r>
+      <w:proofErr w:type="spellStart"/>
+      <w:r>
+        <w:rPr>
+          <w:rFonts w:ascii="Calibri" w:hAnsi="Calibri"/>
+          <w:color w:val="1E4E79"/>
+          <w:sz w:val="32"/>
+          <w:szCs w:val="32"/>
+        </w:rPr>
+        <w:t>Opportunities</w:t>
+      </w:r>
+      <w:proofErr w:type="spellEnd"/>
+      <w:r>
+        <w:rPr>
+          <w:rFonts w:ascii="Calibri" w:hAnsi="Calibri"/>
+          <w:color w:val="1E4E79"/>
+          <w:sz w:val="32"/>
+          <w:szCs w:val="32"/>
+        </w:rPr>
+        <w:t>)</w:t>
       </w:r>
     </w:p>
     <w:p>
@@ -995,7 +1055,27 @@
           <w:sz w:val="32"/>
           <w:szCs w:val="32"/>
         </w:rPr>
-        <w:t>Menaces (ou Risques = Threats)</w:t>
+        <w:t xml:space="preserve">Menaces (ou Risques = </w:t>
+      </w:r>
+      <w:proofErr w:type="spellStart"/>
+      <w:r>
+        <w:rPr>
+          <w:rFonts w:ascii="Calibri" w:hAnsi="Calibri"/>
+          <w:color w:val="1E4E79"/>
+          <w:sz w:val="32"/>
+          <w:szCs w:val="32"/>
+        </w:rPr>
+        <w:t>Threats</w:t>
+      </w:r>
+      <w:proofErr w:type="spellEnd"/>
+      <w:r>
+        <w:rPr>
+          <w:rFonts w:ascii="Calibri" w:hAnsi="Calibri"/>
+          <w:color w:val="1E4E79"/>
+          <w:sz w:val="32"/>
+          <w:szCs w:val="32"/>
+        </w:rPr>
+        <w:t>)</w:t>
       </w:r>
     </w:p>
     <w:p>
@@ -1203,7 +1283,15 @@
         <w:pStyle w:val="Corpsdetexte"/>
       </w:pPr>
       <w:r>
-        <w:t>L'ETML est équipée actuellement d'environ 800 PCs. Ils ne sont pas tous de la même génération, et la gestion du matériel et des logiciels n'est pas une mince affaire pour 2 personnes.</w:t>
+        <w:t xml:space="preserve">L'ETML est équipée actuellement d'environ 800 </w:t>
+      </w:r>
+      <w:proofErr w:type="spellStart"/>
+      <w:r>
+        <w:t>PCs</w:t>
+      </w:r>
+      <w:proofErr w:type="spellEnd"/>
+      <w:r>
+        <w:t>. Ils ne sont pas tous de la même génération, et la gestion du matériel et des logiciels n'est pas une mince affaire pour 2 personnes.</w:t>
       </w:r>
     </w:p>
     <w:p>
@@ -1211,7 +1299,15 @@
         <w:pStyle w:val="Corpsdetexte"/>
       </w:pPr>
       <w:r>
-        <w:t xml:space="preserve">Une idée serait d'envisager d'utiliser les avantages de la virtualisation pour mettre en place 2 machines serveurs de grande performance qui seraient en shadow, et ces serveurs seraient équipés de serveurs de machines virtuelles. </w:t>
+        <w:t xml:space="preserve">Une idée serait d'envisager d'utiliser les avantages de la virtualisation pour mettre en place 2 machines serveurs de grande performance qui seraient en </w:t>
+      </w:r>
+      <w:proofErr w:type="spellStart"/>
+      <w:r>
+        <w:t>shadow</w:t>
+      </w:r>
+      <w:proofErr w:type="spellEnd"/>
+      <w:r>
+        <w:t xml:space="preserve">, et ces serveurs seraient équipés de serveurs de machines virtuelles. </w:t>
       </w:r>
     </w:p>
     <w:p>
@@ -1219,7 +1315,23 @@
         <w:pStyle w:val="Corpsdetexte"/>
       </w:pPr>
       <w:r>
-        <w:t>Les élèves n'auraient plus qu'à venir avec des pcs portables, et moyennant un vpn, pourraient accéder aux machines virtuelles mises à disposition pour les cours.</w:t>
+        <w:t xml:space="preserve">Les élèves n'auraient plus qu'à venir avec des </w:t>
+      </w:r>
+      <w:proofErr w:type="spellStart"/>
+      <w:r>
+        <w:t>pcs</w:t>
+      </w:r>
+      <w:proofErr w:type="spellEnd"/>
+      <w:r>
+        <w:t xml:space="preserve"> portables, et moyennant un </w:t>
+      </w:r>
+      <w:proofErr w:type="spellStart"/>
+      <w:r>
+        <w:t>vpn</w:t>
+      </w:r>
+      <w:proofErr w:type="spellEnd"/>
+      <w:r>
+        <w:t>, pourraient accéder aux machines virtuelles mises à disposition pour les cours.</w:t>
       </w:r>
     </w:p>
     <w:p>
@@ -1399,7 +1511,6 @@
             <w:vAlign w:val="center"/>
           </w:tcPr>
           <w:p>
-            <w:bookmarkStart w:id="1" w:name="_GoBack"/>
             <w:r>
               <w:t>Opportunités</w:t>
             </w:r>
@@ -1449,7 +1560,6 @@
           <w:p/>
         </w:tc>
       </w:tr>
-      <w:bookmarkEnd w:id="1"/>
       <w:tr>
         <w:tc>
           <w:tcPr>
@@ -1526,8 +1636,10 @@
     <w:p/>
     <w:p>
       <w:r>
-        <w:t>Ceci est la première version</w:t>
+        <w:t>Et voilà le deuxième version</w:t>
       </w:r>
+      <w:bookmarkStart w:id="1" w:name="_GoBack"/>
+      <w:bookmarkEnd w:id="1"/>
     </w:p>
     <w:sectPr>
       <w:headerReference w:type="default" r:id="rId10"/>
@@ -1845,7 +1957,7 @@
               <w:noProof/>
               <w:szCs w:val="16"/>
             </w:rPr>
-            <w:t>4</w:t>
+            <w:t>3</w:t>
           </w:r>
           <w:r>
             <w:rPr>
@@ -2111,7 +2223,7 @@
               <w:noProof/>
               <w:szCs w:val="16"/>
             </w:rPr>
-            <w:t>jeudi 19 janvier 2023 11:16</w:t>
+            <w:t>lundi 29 avril 2024 09:05</w:t>
           </w:r>
           <w:r>
             <w:rPr>
@@ -7821,7 +7933,7 @@
 </file>
 
 <file path=customXml/itemProps1.xml><?xml version="1.0" encoding="utf-8"?>
-<ds:datastoreItem xmlns:ds="http://schemas.openxmlformats.org/officeDocument/2006/customXml" ds:itemID="{4689A753-1D2D-46A9-959F-4E0A24F86555}">
+<ds:datastoreItem xmlns:ds="http://schemas.openxmlformats.org/officeDocument/2006/customXml" ds:itemID="{FAD8EC15-4A3F-4B11-B769-CF108711343B}">
   <ds:schemaRefs>
     <ds:schemaRef ds:uri="http://schemas.openxmlformats.org/officeDocument/2006/bibliography"/>
   </ds:schemaRefs>

</xml_diff>